<commit_message>
fix(contrato): tokenizar header (fuga de nombre), validaciones y robustez
- C1: build ahora procesa headers/footers (el nombre quedaba en el encabezado); verificador y test de render escanean todas las partes word/*.xml
- I1: valida domicilio minimo (calle/colonia/CP/municipio) por separado
- I2: usa ADMIN_CONFIG.apiUrl en vez de URL ngrok duplicada
- I3: resolucion robusta de globals PizZip/docxtemplater
- M1: sumarMeses sin desbordamiento de fin de mes
- M2: acepta NumExterior 0, sucursal sin acentos
- M3: valida nombre y fecha de nacimiento
- M4: quita campo folio muerto
- Tests: casos adversariales + verificacion de estructura de vinetas

Co-Authored-By: Claude Opus 4.8 (1M context) <noreply@anthropic.com>
</commit_message>
<xml_diff>
--- a/plantilla-contrato.docx
+++ b/plantilla-contrato.docx
@@ -8428,7 +8428,7 @@
         <w:sz w:val="14"/>
         <w:szCs w:val="14"/>
       </w:rPr>
-      <w:t>I</w:t>
+      <w:t xml:space="preserve">{nombre_completo}</w:t>
     </w:r>
     <w:r>
       <w:rPr>
@@ -8436,7 +8436,7 @@
         <w:sz w:val="14"/>
         <w:szCs w:val="14"/>
       </w:rPr>
-      <w:t>sis Valeria Evaristo Ramírez</w:t>
+      <w:t xml:space="preserve"/>
     </w:r>
   </w:p>
 </w:hdr>

</xml_diff>

<commit_message>
feat(contrato): checklist de testigos por sucursal antes de generar
Antes de generar el contrato se muestra un checklist con el personal ACTIVO de la
sucursal para elegir: 2 testigos + el Encargado de Sucursal. Recuerda la ultima
seleccion por sucursal (localStorage) y la propone premarcada.

- Plantilla: se tokenizan {testigo_1}, {testigo_2} y {encargado_sucursal}.
  'Guillermo Corrales Cruz' aparecia 3 veces con roles DISTINTOS (testigo, firma
  por los trabajadores en la Comision Mixta, y destinatario del aviso de resultado);
  se resuelven por contexto en reemplazar_guillermo(), no en bloque.
- Valida: 2 testigos distintos + encargado obligatorios; sin ellos no genera y avisa.
- Excluye de la lista al propio empleado que se da de alta.

Co-Authored-By: Claude Opus 4.8 (1M context) <noreply@anthropic.com>
</commit_message>
<xml_diff>
--- a/plantilla-contrato.docx
+++ b/plantilla-contrato.docx
@@ -2138,7 +2138,7 @@
               <w:rPr>
                 <w:b/>
               </w:rPr>
-              <w:t>Guillermo Corrales Cruz</w:t>
+              <w:t xml:space="preserve">{testigo_1}</w:t>
             </w:r>
           </w:p>
         </w:tc>
@@ -2181,7 +2181,7 @@
               <w:rPr>
                 <w:b/>
               </w:rPr>
-              <w:t>Esmeralda Flores López</w:t>
+              <w:t xml:space="preserve">{testigo_2}</w:t>
             </w:r>
           </w:p>
         </w:tc>
@@ -3982,7 +3982,7 @@
           <w:szCs w:val="24"/>
           <w:lang w:eastAsia="es-ES"/>
         </w:rPr>
-        <w:t>Guillermo Corrales Cruz</w:t>
+        <w:t xml:space="preserve">{encargado_sucursal}</w:t>
       </w:r>
     </w:p>
     <w:p>
@@ -4267,7 +4267,7 @@
         <w:rPr>
           <w:rFonts w:ascii="Arial" w:hAnsi="Arial" w:cs="Arial"/>
         </w:rPr>
-        <w:t>Guillermo Corrales Cruz</w:t>
+        <w:t xml:space="preserve">{encargado_sucursal}</w:t>
       </w:r>
       <w:r>
         <w:rPr>

</xml_diff>